<commit_message>
Record the cleanup of 11 October 2026 in the Documentation Cleanup document
Status of every item: 46 done (12 of them on 11 October), CC-41 and CC-42
kept with their reason, CC-49 to CC-53 pending on the FRS branch. Keep and
Update sections, summary, file references and pending items brought up to
date; version 0.10 Draft.

Co-Authored-By: Claude Opus 5.5 <noreply@anthropic.com>
Claude-Session: https://claude.ai/code/session_01VKNMX59m598zKXcFetnd5X
</commit_message>
<xml_diff>
--- a/docs/TISPH/pack/TISPH_Documentation_Cleanup.docx
+++ b/docs/TISPH/pack/TISPH_Documentation_Cleanup.docx
@@ -416,7 +416,7 @@
                               <w:rPr>
                                 <w:color w:val="1D74BA"/>
                               </w:rPr>
-                              <w:t xml:space="preserve">Date - </w:t>
+                              <w:t xml:space="preserve">Date - 11 October 2026</w:t>
                             </w:r>
                             <w:r>
                               <w:rPr>
@@ -424,7 +424,7 @@
                                 <w:bCs/>
                                 <w:color w:val="1D74BA"/>
                               </w:rPr>
-                              <w:t>10 October 2026</w:t>
+                              <w:t xml:space="preserve"/>
                             </w:r>
                           </w:p>
                         </w:txbxContent>
@@ -512,7 +512,7 @@
                               <w:rPr>
                                 <w:color w:val="1D74BA"/>
                               </w:rPr>
-                              <w:t xml:space="preserve">Version - </w:t>
+                              <w:t xml:space="preserve">Version - 0.10 Draft</w:t>
                             </w:r>
                             <w:r>
                               <w:rPr>
@@ -520,7 +520,7 @@
                                 <w:bCs/>
                                 <w:color w:val="1D74BA"/>
                               </w:rPr>
-                              <w:t>0.9 Draft</w:t>
+                              <w:t xml:space="preserve"/>
                             </w:r>
                             <w:r>
                               <w:rPr>
@@ -1856,6 +1856,119 @@
           </w:p>
         </w:tc>
       </w:tr>
+      <w:tr>
+        <w:trPr>
+          <w:cantSplit/>
+        </w:trPr>
+        <w:tc>
+          <w:tcPr>
+            <w:tcW w:w="1197" w:type="dxa"/>
+          </w:tcPr>
+          <w:p>
+            <w:pPr>
+              <w:spacing w:before="40" w:after="40" w:line="240" w:lineRule="auto"/>
+            </w:pPr>
+            <w:r>
+              <w:rPr>
+                <w:rFonts w:ascii="Segoe UI" w:hAnsi="Segoe UI" w:cs="Segoe UI" w:eastAsia="Segoe UI"/>
+                <w:sz w:val="16"/>
+                <w:szCs w:val="16"/>
+              </w:rPr>
+              <w:t xml:space="preserve">11 October 2026</w:t>
+            </w:r>
+          </w:p>
+        </w:tc>
+        <w:tc>
+          <w:tcPr>
+            <w:tcW w:w="829" w:type="dxa"/>
+          </w:tcPr>
+          <w:p>
+            <w:pPr>
+              <w:spacing w:before="40" w:after="40" w:line="240" w:lineRule="auto"/>
+            </w:pPr>
+            <w:r>
+              <w:rPr>
+                <w:rFonts w:ascii="Segoe UI" w:hAnsi="Segoe UI" w:cs="Segoe UI" w:eastAsia="Segoe UI"/>
+                <w:sz w:val="16"/>
+                <w:szCs w:val="16"/>
+              </w:rPr>
+              <w:t xml:space="preserve">0.10 Draft</w:t>
+            </w:r>
+          </w:p>
+        </w:tc>
+        <w:tc>
+          <w:tcPr>
+            <w:tcW w:w="1381" w:type="dxa"/>
+          </w:tcPr>
+          <w:p>
+            <w:pPr>
+              <w:spacing w:before="40" w:after="40" w:line="240" w:lineRule="auto"/>
+            </w:pPr>
+            <w:r>
+              <w:rPr>
+                <w:rFonts w:ascii="Segoe UI" w:hAnsi="Segoe UI" w:cs="Segoe UI" w:eastAsia="Segoe UI"/>
+                <w:sz w:val="16"/>
+                <w:szCs w:val="16"/>
+              </w:rPr>
+              <w:t xml:space="preserve">iorta TechNXT</w:t>
+            </w:r>
+          </w:p>
+        </w:tc>
+        <w:tc>
+          <w:tcPr>
+            <w:tcW w:w="1565" w:type="dxa"/>
+          </w:tcPr>
+          <w:p>
+            <w:pPr>
+              <w:spacing w:before="40" w:after="40" w:line="240" w:lineRule="auto"/>
+            </w:pPr>
+            <w:r>
+              <w:rPr>
+                <w:rFonts w:ascii="Segoe UI" w:hAnsi="Segoe UI" w:cs="Segoe UI" w:eastAsia="Segoe UI"/>
+                <w:sz w:val="16"/>
+                <w:szCs w:val="16"/>
+              </w:rPr>
+              <w:t xml:space="preserve">As above</w:t>
+            </w:r>
+          </w:p>
+        </w:tc>
+        <w:tc>
+          <w:tcPr>
+            <w:tcW w:w="1381" w:type="dxa"/>
+          </w:tcPr>
+          <w:p>
+            <w:pPr>
+              <w:spacing w:before="40" w:after="40" w:line="240" w:lineRule="auto"/>
+            </w:pPr>
+            <w:r>
+              <w:rPr>
+                <w:rFonts w:ascii="Segoe UI" w:hAnsi="Segoe UI" w:cs="Segoe UI" w:eastAsia="Segoe UI"/>
+                <w:sz w:val="16"/>
+                <w:szCs w:val="16"/>
+              </w:rPr>
+              <w:t xml:space="preserve">As above</w:t>
+            </w:r>
+          </w:p>
+        </w:tc>
+        <w:tc>
+          <w:tcPr>
+            <w:tcW w:w="2674" w:type="dxa"/>
+          </w:tcPr>
+          <w:p>
+            <w:pPr>
+              <w:spacing w:before="40" w:after="40" w:line="240" w:lineRule="auto"/>
+            </w:pPr>
+            <w:r>
+              <w:rPr>
+                <w:rFonts w:ascii="Segoe UI" w:hAnsi="Segoe UI" w:cs="Segoe UI" w:eastAsia="Segoe UI"/>
+                <w:sz w:val="16"/>
+                <w:szCs w:val="16"/>
+              </w:rPr>
+              <w:t xml:space="preserve">Cleanup of 11 October 2026: CC-06 archived; CC-24, CC-29 to CC-34, CC-46 and CC-47 removed; CC-40 rewritten as a TISPH index; CC-41 kept (code first) and CC-42 kept (Railway hosts TISPH DEV), both corrected for TISPH; CC-48 done. Pack citations changed before removal. Section 7 and 8 updated; two pending items recorded.</w:t>
+            </w:r>
+          </w:p>
+        </w:tc>
+      </w:tr>
     </w:tbl>
     <w:p xmlns:a="http://schemas.openxmlformats.org/drawingml/2006/main" xmlns:pic="http://schemas.openxmlformats.org/drawingml/2006/picture">
       <w:pPr>
@@ -2168,7 +2281,7 @@
                 <w:sz w:val="16"/>
                 <w:szCs w:val="16"/>
               </w:rPr>
-              <w:t xml:space="preserve">0.9 Draft</w:t>
+              <w:t xml:space="preserve">0.10 Draft</w:t>
             </w:r>
           </w:p>
         </w:tc>
@@ -2211,7 +2324,7 @@
                 <w:sz w:val="16"/>
                 <w:szCs w:val="16"/>
               </w:rPr>
-              <w:t xml:space="preserve">10 October 2026</w:t>
+              <w:t xml:space="preserve">11 October 2026</w:t>
             </w:r>
           </w:p>
         </w:tc>
@@ -2254,7 +2367,7 @@
                 <w:sz w:val="16"/>
                 <w:szCs w:val="16"/>
               </w:rPr>
-              <w:t xml:space="preserve">Draft for review. Cleanup status on 10 October 2026: 34 candidates done (removed or archived), 19 pending (see the Status column)</w:t>
+              <w:t xml:space="preserve">Draft for review. Cleanup status on 11 October 2026: 46 candidates done (removed, archived or rewritten), 2 kept with their reason (CC-41, CC-42), 5 pending on the FRS branch (CC-49 to CC-53)</w:t>
             </w:r>
           </w:p>
         </w:tc>
@@ -2440,43 +2553,43 @@
                 <w:sz w:val="16"/>
                 <w:szCs w:val="16"/>
               </w:rPr>
-              <w:t xml:space="preserve">, every Markdown file of the tree; the FRS branch at commit </w:t>
-            </w:r>
-            <w:r>
-              <w:rPr>
-                <w:rFonts w:ascii="Consolas" w:hAnsi="Consolas" w:cs="Consolas" w:eastAsia="Consolas"/>
-                <w:color w:val="1F3B57"/>
-                <w:sz w:val="14"/>
-                <w:szCs w:val="14"/>
-                <w:shd w:val="clear" w:color="auto" w:fill="F3F5F8"/>
-              </w:rPr>
-              <w:t xml:space="preserve">ccfdfa7e</w:t>
-            </w:r>
-            <w:r>
-              <w:rPr>
-                <w:rFonts w:ascii="Segoe UI" w:hAnsi="Segoe UI" w:cs="Segoe UI" w:eastAsia="Segoe UI"/>
-                <w:sz w:val="16"/>
-                <w:szCs w:val="16"/>
-              </w:rPr>
-              <w:t xml:space="preserve"> (file list read with </w:t>
-            </w:r>
-            <w:r>
-              <w:rPr>
-                <w:rFonts w:ascii="Consolas" w:hAnsi="Consolas" w:cs="Consolas" w:eastAsia="Consolas"/>
-                <w:color w:val="1F3B57"/>
-                <w:sz w:val="14"/>
-                <w:szCs w:val="14"/>
-                <w:shd w:val="clear" w:color="auto" w:fill="F3F5F8"/>
-              </w:rPr>
-              <w:t xml:space="preserve">git ls-tree</w:t>
-            </w:r>
-            <w:r>
-              <w:rPr>
-                <w:rFonts w:ascii="Segoe UI" w:hAnsi="Segoe UI" w:cs="Segoe UI" w:eastAsia="Segoe UI"/>
-                <w:sz w:val="16"/>
-                <w:szCs w:val="16"/>
-              </w:rPr>
-              <w:t xml:space="preserve">)</w:t>
+              <w:t xml:space="preserve">, every Markdown file of the tree; the FRS branch at commit ccfdfa7e (file list read with git ls-tree). Cleanup of 11 October 2026 made on TISPH-DEV after commit 869aef7</w:t>
+            </w:r>
+            <w:r>
+              <w:rPr>
+                <w:rFonts w:ascii="Consolas" w:hAnsi="Consolas" w:cs="Consolas" w:eastAsia="Consolas"/>
+                <w:color w:val="1F3B57"/>
+                <w:sz w:val="14"/>
+                <w:szCs w:val="14"/>
+                <w:shd w:val="clear" w:color="auto" w:fill="F3F5F8"/>
+              </w:rPr>
+              <w:t xml:space="preserve"/>
+            </w:r>
+            <w:r>
+              <w:rPr>
+                <w:rFonts w:ascii="Segoe UI" w:hAnsi="Segoe UI" w:cs="Segoe UI" w:eastAsia="Segoe UI"/>
+                <w:sz w:val="16"/>
+                <w:szCs w:val="16"/>
+              </w:rPr>
+              <w:t xml:space="preserve"/>
+            </w:r>
+            <w:r>
+              <w:rPr>
+                <w:rFonts w:ascii="Consolas" w:hAnsi="Consolas" w:cs="Consolas" w:eastAsia="Consolas"/>
+                <w:color w:val="1F3B57"/>
+                <w:sz w:val="14"/>
+                <w:szCs w:val="14"/>
+                <w:shd w:val="clear" w:color="auto" w:fill="F3F5F8"/>
+              </w:rPr>
+              <w:t xml:space="preserve"/>
+            </w:r>
+            <w:r>
+              <w:rPr>
+                <w:rFonts w:ascii="Segoe UI" w:hAnsi="Segoe UI" w:cs="Segoe UI" w:eastAsia="Segoe UI"/>
+                <w:sz w:val="16"/>
+                <w:szCs w:val="16"/>
+              </w:rPr>
+              <w:t xml:space="preserve"/>
             </w:r>
           </w:p>
         </w:tc>
@@ -6177,87 +6290,7 @@
                 <w:sz w:val="16"/>
                 <w:szCs w:val="16"/>
               </w:rPr>
-              <w:t xml:space="preserve">Pending</w:t>
-            </w:r>
-            <w:r>
-              <w:rPr>
-                <w:rFonts w:ascii="Segoe UI" w:hAnsi="Segoe UI" w:cs="Segoe UI" w:eastAsia="Segoe UI"/>
-                <w:sz w:val="16"/>
-                <w:szCs w:val="16"/>
-              </w:rPr>
-              <w:t xml:space="preserve">: </w:t>
-            </w:r>
-            <w:r>
-              <w:rPr>
-                <w:rFonts w:ascii="Consolas" w:hAnsi="Consolas" w:cs="Consolas" w:eastAsia="Consolas"/>
-                <w:color w:val="1F3B57"/>
-                <w:sz w:val="14"/>
-                <w:szCs w:val="14"/>
-                <w:shd w:val="clear" w:color="auto" w:fill="F3F5F8"/>
-              </w:rPr>
-              <w:t xml:space="preserve">docs/TISPH/pack/TISPH_NFR_Compliance.docx</w:t>
-            </w:r>
-            <w:r>
-              <w:rPr>
-                <w:rFonts w:ascii="Segoe UI" w:hAnsi="Segoe UI" w:cs="Segoe UI" w:eastAsia="Segoe UI"/>
-                <w:sz w:val="16"/>
-                <w:szCs w:val="16"/>
-              </w:rPr>
-              <w:t xml:space="preserve"> Appendix A3.1 cites </w:t>
-            </w:r>
-            <w:r>
-              <w:rPr>
-                <w:rFonts w:ascii="Consolas" w:hAnsi="Consolas" w:cs="Consolas" w:eastAsia="Consolas"/>
-                <w:color w:val="1F3B57"/>
-                <w:sz w:val="14"/>
-                <w:szCs w:val="14"/>
-                <w:shd w:val="clear" w:color="auto" w:fill="F3F5F8"/>
-              </w:rPr>
-              <w:t xml:space="preserve">tools/src/06_capacity_performance.md</w:t>
-            </w:r>
-            <w:r>
-              <w:rPr>
-                <w:rFonts w:ascii="Segoe UI" w:hAnsi="Segoe UI" w:cs="Segoe UI" w:eastAsia="Segoe UI"/>
-                <w:sz w:val="16"/>
-                <w:szCs w:val="16"/>
-              </w:rPr>
-              <w:t xml:space="preserve"> for the test method; move that method into the TISPH test strategy (</w:t>
-            </w:r>
-            <w:r>
-              <w:rPr>
-                <w:rFonts w:ascii="Consolas" w:hAnsi="Consolas" w:cs="Consolas" w:eastAsia="Consolas"/>
-                <w:color w:val="1F3B57"/>
-                <w:sz w:val="14"/>
-                <w:szCs w:val="14"/>
-                <w:shd w:val="clear" w:color="auto" w:fill="F3F5F8"/>
-              </w:rPr>
-              <w:t xml:space="preserve">docs/TISPH/pack/TISPH_Document_Register.docx</w:t>
-            </w:r>
-            <w:r>
-              <w:rPr>
-                <w:rFonts w:ascii="Segoe UI" w:hAnsi="Segoe UI" w:cs="Segoe UI" w:eastAsia="Segoe UI"/>
-                <w:sz w:val="16"/>
-                <w:szCs w:val="16"/>
-              </w:rPr>
-              <w:t xml:space="preserve"> DR-16) first. Keep </w:t>
-            </w:r>
-            <w:r>
-              <w:rPr>
-                <w:rFonts w:ascii="Consolas" w:hAnsi="Consolas" w:cs="Consolas" w:eastAsia="Consolas"/>
-                <w:color w:val="1F3B57"/>
-                <w:sz w:val="14"/>
-                <w:szCs w:val="14"/>
-                <w:shd w:val="clear" w:color="auto" w:fill="F3F5F8"/>
-              </w:rPr>
-              <w:t xml:space="preserve">tools/loadtest.mjs</w:t>
-            </w:r>
-            <w:r>
-              <w:rPr>
-                <w:rFonts w:ascii="Segoe UI" w:hAnsi="Segoe UI" w:cs="Segoe UI" w:eastAsia="Segoe UI"/>
-                <w:sz w:val="16"/>
-                <w:szCs w:val="16"/>
-              </w:rPr>
-              <w:t xml:space="preserve"> and its result files</w:t>
+              <w:t xml:space="preserve">Done (11 October 2026): archived to docs/archive/2026-10-11/architecture/ as the record of the indicative load test. The test method is in docs/TISPH/testing/TISPH_Test_Strategy.docx section 3, and docs/TISPH/pack/TISPH_NFR_Compliance.docx Appendix A3.1 cites it. tools/loadtest.mjs and its result files are kept</w:t>
             </w:r>
           </w:p>
         </w:tc>
@@ -10430,15 +10463,7 @@
                 <w:sz w:val="16"/>
                 <w:szCs w:val="16"/>
               </w:rPr>
-              <w:t xml:space="preserve">Pending</w:t>
-            </w:r>
-            <w:r>
-              <w:rPr>
-                <w:rFonts w:ascii="Segoe UI" w:hAnsi="Segoe UI" w:cs="Segoe UI" w:eastAsia="Segoe UI"/>
-                <w:sz w:val="16"/>
-                <w:szCs w:val="16"/>
-              </w:rPr>
-              <w:t xml:space="preserve">: Ask TISPH Information Security whether it still wants the questionnaire answered in this form</w:t>
+              <w:t xml:space="preserve">Done (11 October 2026): removed with its workbook builder. TISPH security is described in docs/TISPH/pack/TISPH_Security_Architecture.docx; a questionnaire TISPH Information Security sends is answered from it</w:t>
             </w:r>
           </w:p>
         </w:tc>
@@ -11453,15 +11478,7 @@
                 <w:sz w:val="16"/>
                 <w:szCs w:val="16"/>
               </w:rPr>
-              <w:t xml:space="preserve">Pending</w:t>
-            </w:r>
-            <w:r>
-              <w:rPr>
-                <w:rFonts w:ascii="Segoe UI" w:hAnsi="Segoe UI" w:cs="Segoe UI" w:eastAsia="Segoe UI"/>
-                <w:sz w:val="16"/>
-                <w:szCs w:val="16"/>
-              </w:rPr>
-              <w:t xml:space="preserve">: no precondition recorded; removal not yet scheduled</w:t>
+              <w:t xml:space="preserve">Done (11 October 2026): removed. docs/TISPH/pack/TISPH_Delivery_Governance.docx 11.2 and Appendix A cite its sections 10 and 11 instead</w:t>
             </w:r>
           </w:p>
         </w:tc>
@@ -11640,15 +11657,7 @@
                 <w:sz w:val="16"/>
                 <w:szCs w:val="16"/>
               </w:rPr>
-              <w:t xml:space="preserve">Pending</w:t>
-            </w:r>
-            <w:r>
-              <w:rPr>
-                <w:rFonts w:ascii="Segoe UI" w:hAnsi="Segoe UI" w:cs="Segoe UI" w:eastAsia="Segoe UI"/>
-                <w:sz w:val="16"/>
-                <w:szCs w:val="16"/>
-              </w:rPr>
-              <w:t xml:space="preserve">: FRS for the remaining build items</w:t>
+              <w:t xml:space="preserve">Done (11 October 2026): removed with its images and builders. The baseline is the signed BRD v2.2 and the FRS (docs/TISPH/frs/)</w:t>
             </w:r>
           </w:p>
         </w:tc>
@@ -11811,15 +11820,7 @@
                 <w:sz w:val="16"/>
                 <w:szCs w:val="16"/>
               </w:rPr>
-              <w:t xml:space="preserve">Pending</w:t>
-            </w:r>
-            <w:r>
-              <w:rPr>
-                <w:rFonts w:ascii="Segoe UI" w:hAnsi="Segoe UI" w:cs="Segoe UI" w:eastAsia="Segoe UI"/>
-                <w:sz w:val="16"/>
-                <w:szCs w:val="16"/>
-              </w:rPr>
-              <w:t xml:space="preserve">: TISPH Compliance to confirm which regulatory items it wants tracked separately</w:t>
+              <w:t xml:space="preserve">Done (11 October 2026): removed. Regulatory rows are in docs/TISPH/pack/TISPH_NFR_Compliance.docx and the FRS</w:t>
             </w:r>
           </w:p>
         </w:tc>
@@ -12098,51 +12099,7 @@
                 <w:sz w:val="16"/>
                 <w:szCs w:val="16"/>
               </w:rPr>
-              <w:t xml:space="preserve">Pending</w:t>
-            </w:r>
-            <w:r>
-              <w:rPr>
-                <w:rFonts w:ascii="Segoe UI" w:hAnsi="Segoe UI" w:cs="Segoe UI" w:eastAsia="Segoe UI"/>
-                <w:sz w:val="16"/>
-                <w:szCs w:val="16"/>
-              </w:rPr>
-              <w:t xml:space="preserve">: </w:t>
-            </w:r>
-            <w:r>
-              <w:rPr>
-                <w:rFonts w:ascii="Consolas" w:hAnsi="Consolas" w:cs="Consolas" w:eastAsia="Consolas"/>
-                <w:color w:val="1F3B57"/>
-                <w:sz w:val="14"/>
-                <w:szCs w:val="14"/>
-                <w:shd w:val="clear" w:color="auto" w:fill="F3F5F8"/>
-              </w:rPr>
-              <w:t xml:space="preserve">docs/TISPH/pack/TISPH_Operations_and_Support.docx</w:t>
-            </w:r>
-            <w:r>
-              <w:rPr>
-                <w:rFonts w:ascii="Segoe UI" w:hAnsi="Segoe UI" w:cs="Segoe UI" w:eastAsia="Segoe UI"/>
-                <w:sz w:val="16"/>
-                <w:szCs w:val="16"/>
-              </w:rPr>
-              <w:t xml:space="preserve"> A3.10 cites </w:t>
-            </w:r>
-            <w:r>
-              <w:rPr>
-                <w:rFonts w:ascii="Consolas" w:hAnsi="Consolas" w:cs="Consolas" w:eastAsia="Consolas"/>
-                <w:color w:val="1F3B57"/>
-                <w:sz w:val="14"/>
-                <w:szCs w:val="14"/>
-                <w:shd w:val="clear" w:color="auto" w:fill="F3F5F8"/>
-              </w:rPr>
-              <w:t xml:space="preserve">schedules-and-batch-jobs.md</w:t>
-            </w:r>
-            <w:r>
-              <w:rPr>
-                <w:rFonts w:ascii="Segoe UI" w:hAnsi="Segoe UI" w:cs="Segoe UI" w:eastAsia="Segoe UI"/>
-                <w:sz w:val="16"/>
-                <w:szCs w:val="16"/>
-              </w:rPr>
-              <w:t xml:space="preserve">; change the citation</w:t>
+              <w:t xml:space="preserve">Done (11 October 2026): removed with the touchpoint workbook builder. docs/TISPH/pack/TISPH_Operations_and_Support.docx A3.10 no longer cites schedules-and-batch-jobs.md; its sections 9 and 10 hold the jobs and runbooks of the TISPH build</w:t>
             </w:r>
           </w:p>
         </w:tc>
@@ -12323,15 +12280,7 @@
                 <w:sz w:val="16"/>
                 <w:szCs w:val="16"/>
               </w:rPr>
-              <w:t xml:space="preserve">Pending</w:t>
-            </w:r>
-            <w:r>
-              <w:rPr>
-                <w:rFonts w:ascii="Segoe UI" w:hAnsi="Segoe UI" w:cs="Segoe UI" w:eastAsia="Segoe UI"/>
-                <w:sz w:val="16"/>
-                <w:szCs w:val="16"/>
-              </w:rPr>
-              <w:t xml:space="preserve">: no precondition recorded; removal not yet scheduled</w:t>
+              <w:t xml:space="preserve">Done (11 October 2026): removed with the RAID log builder. docs/TISPH/pack/TISPH_Delivery_Governance.docx cites its section 5 (risk register, decision log) instead</w:t>
             </w:r>
           </w:p>
         </w:tc>
@@ -12540,33 +12489,7 @@
                 <w:sz w:val="16"/>
                 <w:szCs w:val="16"/>
               </w:rPr>
-              <w:t xml:space="preserve">Pending</w:t>
-            </w:r>
-            <w:r>
-              <w:rPr>
-                <w:rFonts w:ascii="Segoe UI" w:hAnsi="Segoe UI" w:cs="Segoe UI" w:eastAsia="Segoe UI"/>
-                <w:sz w:val="16"/>
-                <w:szCs w:val="16"/>
-              </w:rPr>
-              <w:t xml:space="preserve">: </w:t>
-            </w:r>
-            <w:r>
-              <w:rPr>
-                <w:rFonts w:ascii="Consolas" w:hAnsi="Consolas" w:cs="Consolas" w:eastAsia="Consolas"/>
-                <w:color w:val="1F3B57"/>
-                <w:sz w:val="14"/>
-                <w:szCs w:val="14"/>
-                <w:shd w:val="clear" w:color="auto" w:fill="F3F5F8"/>
-              </w:rPr>
-              <w:t xml:space="preserve">docs/TISPH/pack/TISPH_Operations_and_Support.docx</w:t>
-            </w:r>
-            <w:r>
-              <w:rPr>
-                <w:rFonts w:ascii="Segoe UI" w:hAnsi="Segoe UI" w:cs="Segoe UI" w:eastAsia="Segoe UI"/>
-                <w:sz w:val="16"/>
-                <w:szCs w:val="16"/>
-              </w:rPr>
-              <w:t xml:space="preserve"> 15.1 and A3.10 list them as templates to tailor (P29); retire once P29 is done</w:t>
+              <w:t xml:space="preserve">Done (11 October 2026): removed. docs/TISPH/pack/TISPH_Operations_and_Support.docx 15.1 and A3.10 cite its sections 4 to 13 instead; P29 narrowed to the items of the support agreement</w:t>
             </w:r>
           </w:p>
         </w:tc>
@@ -14063,105 +13986,7 @@
                 <w:sz w:val="16"/>
                 <w:szCs w:val="16"/>
               </w:rPr>
-              <w:t xml:space="preserve">Pending</w:t>
-            </w:r>
-            <w:r>
-              <w:rPr>
-                <w:rFonts w:ascii="Segoe UI" w:hAnsi="Segoe UI" w:cs="Segoe UI" w:eastAsia="Segoe UI"/>
-                <w:sz w:val="16"/>
-                <w:szCs w:val="16"/>
-              </w:rPr>
-              <w:t xml:space="preserve">: </w:t>
-            </w:r>
-            <w:r>
-              <w:rPr>
-                <w:rFonts w:ascii="Consolas" w:hAnsi="Consolas" w:cs="Consolas" w:eastAsia="Consolas"/>
-                <w:color w:val="1F3B57"/>
-                <w:sz w:val="14"/>
-                <w:szCs w:val="14"/>
-                <w:shd w:val="clear" w:color="auto" w:fill="F3F5F8"/>
-              </w:rPr>
-              <w:t xml:space="preserve">docs/TISPH/pack/TISPH_Solution_Architecture.docx</w:t>
-            </w:r>
-            <w:r>
-              <w:rPr>
-                <w:rFonts w:ascii="Segoe UI" w:hAnsi="Segoe UI" w:cs="Segoe UI" w:eastAsia="Segoe UI"/>
-                <w:sz w:val="16"/>
-                <w:szCs w:val="16"/>
-              </w:rPr>
-              <w:t xml:space="preserve"> (sections 5, 11, 14, Appendix A) cites its section 9 "Known limitations"; move those limitations into </w:t>
-            </w:r>
-            <w:r>
-              <w:rPr>
-                <w:rFonts w:ascii="Consolas" w:hAnsi="Consolas" w:cs="Consolas" w:eastAsia="Consolas"/>
-                <w:color w:val="1F3B57"/>
-                <w:sz w:val="14"/>
-                <w:szCs w:val="14"/>
-                <w:shd w:val="clear" w:color="auto" w:fill="F3F5F8"/>
-              </w:rPr>
-              <w:t xml:space="preserve">docs/TISPH/pack/TISPH_Solution_Architecture.docx</w:t>
-            </w:r>
-            <w:r>
-              <w:rPr>
-                <w:rFonts w:ascii="Segoe UI" w:hAnsi="Segoe UI" w:cs="Segoe UI" w:eastAsia="Segoe UI"/>
-                <w:sz w:val="16"/>
-                <w:szCs w:val="16"/>
-              </w:rPr>
-              <w:t xml:space="preserve"> or </w:t>
-            </w:r>
-            <w:r>
-              <w:rPr>
-                <w:rFonts w:ascii="Consolas" w:hAnsi="Consolas" w:cs="Consolas" w:eastAsia="Consolas"/>
-                <w:color w:val="1F3B57"/>
-                <w:sz w:val="14"/>
-                <w:szCs w:val="14"/>
-                <w:shd w:val="clear" w:color="auto" w:fill="F3F5F8"/>
-              </w:rPr>
-              <w:t xml:space="preserve">docs/TISPH/pack/TISPH_Operations_and_Support.docx</w:t>
-            </w:r>
-            <w:r>
-              <w:rPr>
-                <w:rFonts w:ascii="Segoe UI" w:hAnsi="Segoe UI" w:cs="Segoe UI" w:eastAsia="Segoe UI"/>
-                <w:sz w:val="16"/>
-                <w:szCs w:val="16"/>
-              </w:rPr>
-              <w:t xml:space="preserve"> section 17 first. </w:t>
-            </w:r>
-            <w:r>
-              <w:rPr>
-                <w:rFonts w:ascii="Consolas" w:hAnsi="Consolas" w:cs="Consolas" w:eastAsia="Consolas"/>
-                <w:color w:val="1F3B57"/>
-                <w:sz w:val="14"/>
-                <w:szCs w:val="14"/>
-                <w:shd w:val="clear" w:color="auto" w:fill="F3F5F8"/>
-              </w:rPr>
-              <w:t xml:space="preserve">docs/TISPH/pack/TISPH_Operations_and_Support.docx</w:t>
-            </w:r>
-            <w:r>
-              <w:rPr>
-                <w:rFonts w:ascii="Segoe UI" w:hAnsi="Segoe UI" w:cs="Segoe UI" w:eastAsia="Segoe UI"/>
-                <w:sz w:val="16"/>
-                <w:szCs w:val="16"/>
-              </w:rPr>
-              <w:t xml:space="preserve"> 15.1 also notes </w:t>
-            </w:r>
-            <w:r>
-              <w:rPr>
-                <w:rFonts w:ascii="Consolas" w:hAnsi="Consolas" w:cs="Consolas" w:eastAsia="Consolas"/>
-                <w:color w:val="1F3B57"/>
-                <w:sz w:val="14"/>
-                <w:szCs w:val="14"/>
-                <w:shd w:val="clear" w:color="auto" w:fill="F3F5F8"/>
-              </w:rPr>
-              <w:t xml:space="preserve">SUPPORT_AND_ESCALATION.md</w:t>
-            </w:r>
-            <w:r>
-              <w:rPr>
-                <w:rFonts w:ascii="Segoe UI" w:hAnsi="Segoe UI" w:cs="Segoe UI" w:eastAsia="Segoe UI"/>
-                <w:sz w:val="16"/>
-                <w:szCs w:val="16"/>
-              </w:rPr>
-              <w:t xml:space="preserve"> points to it</w:t>
+              <w:t xml:space="preserve">Done (11 October 2026): rewritten as a short index of deploy/ for TISPH (where each environment runs). Section 9 moved to docs/TISPH/pack/TISPH_Operations_and_Support.docx section 17 (L15 tokens, L16 Filipino; the rate-limit item is L4; the QR-code item no longer applies). Citations changed in docs/TISPH/pack/TISPH_Solution_Architecture.docx, TISPH_Delivery_Governance.docx and TISPH_Data_Migration_and_Cutover.docx; SUPPORT_AND_ESCALATION.md no longer points to it</w:t>
             </w:r>
           </w:p>
         </w:tc>
@@ -14372,43 +14197,7 @@
                 <w:sz w:val="16"/>
                 <w:szCs w:val="16"/>
               </w:rPr>
-              <w:t xml:space="preserve">Pending</w:t>
-            </w:r>
-            <w:r>
-              <w:rPr>
-                <w:rFonts w:ascii="Segoe UI" w:hAnsi="Segoe UI" w:cs="Segoe UI" w:eastAsia="Segoe UI"/>
-                <w:sz w:val="16"/>
-                <w:szCs w:val="16"/>
-              </w:rPr>
-              <w:t xml:space="preserve">: </w:t>
-            </w:r>
-            <w:r>
-              <w:rPr>
-                <w:rFonts w:ascii="Consolas" w:hAnsi="Consolas" w:cs="Consolas" w:eastAsia="Consolas"/>
-                <w:color w:val="1F3B57"/>
-                <w:sz w:val="14"/>
-                <w:szCs w:val="14"/>
-                <w:shd w:val="clear" w:color="auto" w:fill="F3F5F8"/>
-              </w:rPr>
-              <w:t xml:space="preserve">docs/TISPH/pack/TISPH_Operations_and_Support.docx</w:t>
-            </w:r>
-            <w:r>
-              <w:rPr>
-                <w:rFonts w:ascii="Segoe UI" w:hAnsi="Segoe UI" w:cs="Segoe UI" w:eastAsia="Segoe UI"/>
-                <w:sz w:val="16"/>
-                <w:szCs w:val="16"/>
-              </w:rPr>
-              <w:t xml:space="preserve"> A3.5 cites its sections 8 to 11; change the citation to </w:t>
-            </w:r>
-            <w:r>
-              <w:rPr>
-                <w:rFonts w:ascii="Consolas" w:hAnsi="Consolas" w:cs="Consolas" w:eastAsia="Consolas"/>
-                <w:color w:val="1F3B57"/>
-                <w:sz w:val="14"/>
-                <w:szCs w:val="14"/>
-                <w:shd w:val="clear" w:color="auto" w:fill="F3F5F8"/>
-              </w:rPr>
-              <w:t xml:space="preserve">docs/TISPH/pack/TISPH_Environments_and_Release.docx</w:t>
+              <w:t xml:space="preserve">Kept (code first): ci.yml, deploy.yml, rollback.yml, deploy/ec2/deploy.sh, deploy/package-backend.sh and deploy/frontend.env.example point to it. A TISPH note (11 October 2026) says that brokerverse-platform is the product branch, not the TISPH trunk, and that this pipeline does not deploy TISPH. docs/TISPH/pack/TISPH_Operations_and_Support.docx 15.1 and A3.5 cite docs/TISPH/pack/TISPH_Environments_and_Release.docx sections 6 to 11</w:t>
             </w:r>
           </w:p>
         </w:tc>
@@ -14581,15 +14370,7 @@
                 <w:sz w:val="16"/>
                 <w:szCs w:val="16"/>
               </w:rPr>
-              <w:t xml:space="preserve">Pending</w:t>
-            </w:r>
-            <w:r>
-              <w:rPr>
-                <w:rFonts w:ascii="Segoe UI" w:hAnsi="Segoe UI" w:cs="Segoe UI" w:eastAsia="Segoe UI"/>
-                <w:sz w:val="16"/>
-                <w:szCs w:val="16"/>
-              </w:rPr>
-              <w:t xml:space="preserve">: Retire when the Azure DEV, SIT and UAT environments replace Railway for TISPH</w:t>
+              <w:t xml:space="preserve">Kept: Railway hosts TISPH DEV until Azure DEV is provisioned. Updated 11 October 2026 to describe project tisph-dev (services api and web deployed from TISPH-DEV, ENVIRONMENT_NAME=DEV, BRAND_PACK=toyota-insurance-services); UAT goes to Azure or another approved environment after TISPH confirms</w:t>
             </w:r>
           </w:p>
         </w:tc>
@@ -15373,15 +15154,7 @@
                 <w:sz w:val="16"/>
                 <w:szCs w:val="16"/>
               </w:rPr>
-              <w:t xml:space="preserve">Pending</w:t>
-            </w:r>
-            <w:r>
-              <w:rPr>
-                <w:rFonts w:ascii="Segoe UI" w:hAnsi="Segoe UI" w:cs="Segoe UI" w:eastAsia="Segoe UI"/>
-                <w:sz w:val="16"/>
-                <w:szCs w:val="16"/>
-              </w:rPr>
-              <w:t xml:space="preserve">: MAN-B complete</w:t>
+              <w:t xml:space="preserve">Done (11 October 2026): removed with docs/decks/tools/. Replaced by the role chapters of the TISPH user manual (docs/TISPH/manual/chapters/role-*.md), served in the Help</w:t>
             </w:r>
           </w:p>
         </w:tc>
@@ -15598,51 +15371,7 @@
                 <w:sz w:val="16"/>
                 <w:szCs w:val="16"/>
               </w:rPr>
-              <w:t xml:space="preserve">Pending</w:t>
-            </w:r>
-            <w:r>
-              <w:rPr>
-                <w:rFonts w:ascii="Segoe UI" w:hAnsi="Segoe UI" w:cs="Segoe UI" w:eastAsia="Segoe UI"/>
-                <w:sz w:val="16"/>
-                <w:szCs w:val="16"/>
-              </w:rPr>
-              <w:t xml:space="preserve">: The decks (CC-46) take their screens from </w:t>
-            </w:r>
-            <w:r>
-              <w:rPr>
-                <w:rFonts w:ascii="Consolas" w:hAnsi="Consolas" w:cs="Consolas" w:eastAsia="Consolas"/>
-                <w:color w:val="1F3B57"/>
-                <w:sz w:val="14"/>
-                <w:szCs w:val="14"/>
-                <w:shd w:val="clear" w:color="auto" w:fill="F3F5F8"/>
-              </w:rPr>
-              <w:t xml:space="preserve">docs/manual/images/</w:t>
-            </w:r>
-            <w:r>
-              <w:rPr>
-                <w:rFonts w:ascii="Segoe UI" w:hAnsi="Segoe UI" w:cs="Segoe UI" w:eastAsia="Segoe UI"/>
-                <w:sz w:val="16"/>
-                <w:szCs w:val="16"/>
-              </w:rPr>
-              <w:t xml:space="preserve"> and rules from </w:t>
-            </w:r>
-            <w:r>
-              <w:rPr>
-                <w:rFonts w:ascii="Consolas" w:hAnsi="Consolas" w:cs="Consolas" w:eastAsia="Consolas"/>
-                <w:color w:val="1F3B57"/>
-                <w:sz w:val="14"/>
-                <w:szCs w:val="14"/>
-                <w:shd w:val="clear" w:color="auto" w:fill="F3F5F8"/>
-              </w:rPr>
-              <w:t xml:space="preserve">docs/manual/tools/manual_source.md</w:t>
-            </w:r>
-            <w:r>
-              <w:rPr>
-                <w:rFonts w:ascii="Segoe UI" w:hAnsi="Segoe UI" w:cs="Segoe UI" w:eastAsia="Segoe UI"/>
-                <w:sz w:val="16"/>
-                <w:szCs w:val="16"/>
-              </w:rPr>
-              <w:t xml:space="preserve">; retire with the decks</w:t>
+              <w:t xml:space="preserve">Done (11 October 2026): removed with the decks (CC-46). The Help is built from docs/TISPH/manual/ (TISPH edition) and docs/package/source/user-manual.md (base edition)</w:t>
             </w:r>
           </w:p>
         </w:tc>
@@ -16127,51 +15856,7 @@
                 <w:sz w:val="16"/>
                 <w:szCs w:val="16"/>
               </w:rPr>
-              <w:t xml:space="preserve">Pending</w:t>
-            </w:r>
-            <w:r>
-              <w:rPr>
-                <w:rFonts w:ascii="Segoe UI" w:hAnsi="Segoe UI" w:cs="Segoe UI" w:eastAsia="Segoe UI"/>
-                <w:sz w:val="16"/>
-                <w:szCs w:val="16"/>
-              </w:rPr>
-              <w:t xml:space="preserve">: confirm that the FRS set in </w:t>
-            </w:r>
-            <w:r>
-              <w:rPr>
-                <w:rFonts w:ascii="Consolas" w:hAnsi="Consolas" w:cs="Consolas" w:eastAsia="Consolas"/>
-                <w:color w:val="1F3B57"/>
-                <w:sz w:val="14"/>
-                <w:szCs w:val="14"/>
-                <w:shd w:val="clear" w:color="auto" w:fill="F3F5F8"/>
-              </w:rPr>
-              <w:t xml:space="preserve">docs/TISPH/frs/</w:t>
-            </w:r>
-            <w:r>
-              <w:rPr>
-                <w:rFonts w:ascii="Segoe UI" w:hAnsi="Segoe UI" w:cs="Segoe UI" w:eastAsia="Segoe UI"/>
-                <w:sz w:val="16"/>
-                <w:szCs w:val="16"/>
-              </w:rPr>
-              <w:t xml:space="preserve"> on </w:t>
-            </w:r>
-            <w:r>
-              <w:rPr>
-                <w:rFonts w:ascii="Consolas" w:hAnsi="Consolas" w:cs="Consolas" w:eastAsia="Consolas"/>
-                <w:color w:val="1F3B57"/>
-                <w:sz w:val="14"/>
-                <w:szCs w:val="14"/>
-                <w:shd w:val="clear" w:color="auto" w:fill="F3F5F8"/>
-              </w:rPr>
-              <w:t xml:space="preserve">TISPH-DEV</w:t>
-            </w:r>
-            <w:r>
-              <w:rPr>
-                <w:rFonts w:ascii="Segoe UI" w:hAnsi="Segoe UI" w:cs="Segoe UI" w:eastAsia="Segoe UI"/>
-                <w:sz w:val="16"/>
-                <w:szCs w:val="16"/>
-              </w:rPr>
-              <w:t xml:space="preserve"> is complete, so that the FRS branch can be retired (CC-49 to CC-53)</w:t>
+              <w:t xml:space="preserve">Done: docs/TISPH/frs/ on TISPH-DEV holds the ten FRS files</w:t>
             </w:r>
           </w:p>
         </w:tc>
@@ -16334,15 +16019,7 @@
                 <w:sz w:val="16"/>
                 <w:szCs w:val="16"/>
               </w:rPr>
-              <w:t xml:space="preserve">Pending</w:t>
-            </w:r>
-            <w:r>
-              <w:rPr>
-                <w:rFonts w:ascii="Segoe UI" w:hAnsi="Segoe UI" w:cs="Segoe UI" w:eastAsia="Segoe UI"/>
-                <w:sz w:val="16"/>
-                <w:szCs w:val="16"/>
-              </w:rPr>
-              <w:t xml:space="preserve">: Copy CC-48 first</w:t>
+              <w:t xml:space="preserve">Pending (FRS branch, outside TISPH-DEV): CC-48 is done; removed when the FRS branch is retired</w:t>
             </w:r>
           </w:p>
         </w:tc>
@@ -16505,15 +16182,7 @@
                 <w:sz w:val="16"/>
                 <w:szCs w:val="16"/>
               </w:rPr>
-              <w:t xml:space="preserve">Pending</w:t>
-            </w:r>
-            <w:r>
-              <w:rPr>
-                <w:rFonts w:ascii="Segoe UI" w:hAnsi="Segoe UI" w:cs="Segoe UI" w:eastAsia="Segoe UI"/>
-                <w:sz w:val="16"/>
-                <w:szCs w:val="16"/>
-              </w:rPr>
-              <w:t xml:space="preserve">: removed with the FRS branch, after CC-48 is copied</w:t>
+              <w:t xml:space="preserve">Pending (FRS branch, outside TISPH-DEV): removed when the FRS branch is retired</w:t>
             </w:r>
           </w:p>
         </w:tc>
@@ -16730,15 +16399,7 @@
                 <w:sz w:val="16"/>
                 <w:szCs w:val="16"/>
               </w:rPr>
-              <w:t xml:space="preserve">Pending</w:t>
-            </w:r>
-            <w:r>
-              <w:rPr>
-                <w:rFonts w:ascii="Segoe UI" w:hAnsi="Segoe UI" w:cs="Segoe UI" w:eastAsia="Segoe UI"/>
-                <w:sz w:val="16"/>
-                <w:szCs w:val="16"/>
-              </w:rPr>
-              <w:t xml:space="preserve">: removed with the FRS branch, after CC-48 is copied</w:t>
+              <w:t xml:space="preserve">Pending (FRS branch, outside TISPH-DEV): removed when the FRS branch is retired</w:t>
             </w:r>
           </w:p>
         </w:tc>
@@ -16891,15 +16552,7 @@
                 <w:sz w:val="16"/>
                 <w:szCs w:val="16"/>
               </w:rPr>
-              <w:t xml:space="preserve">Pending</w:t>
-            </w:r>
-            <w:r>
-              <w:rPr>
-                <w:rFonts w:ascii="Segoe UI" w:hAnsi="Segoe UI" w:cs="Segoe UI" w:eastAsia="Segoe UI"/>
-                <w:sz w:val="16"/>
-                <w:szCs w:val="16"/>
-              </w:rPr>
-              <w:t xml:space="preserve">: removed with the FRS branch, after CC-48 is copied</w:t>
+              <w:t xml:space="preserve">Pending (FRS branch, outside TISPH-DEV): removed when the FRS branch is retired</w:t>
             </w:r>
           </w:p>
         </w:tc>
@@ -17034,15 +16687,7 @@
                 <w:sz w:val="16"/>
                 <w:szCs w:val="16"/>
               </w:rPr>
-              <w:t xml:space="preserve">Pending</w:t>
-            </w:r>
-            <w:r>
-              <w:rPr>
-                <w:rFonts w:ascii="Segoe UI" w:hAnsi="Segoe UI" w:cs="Segoe UI" w:eastAsia="Segoe UI"/>
-                <w:sz w:val="16"/>
-                <w:szCs w:val="16"/>
-              </w:rPr>
-              <w:t xml:space="preserve">: removed with the FRS branch, after CC-48 is copied</w:t>
+              <w:t xml:space="preserve">Pending (FRS branch, outside TISPH-DEV): removed when the FRS branch is retired</w:t>
             </w:r>
           </w:p>
         </w:tc>
@@ -17078,7 +16723,7 @@
         <w:rPr>
           <w:rFonts w:ascii="Segoe UI" w:hAnsi="Segoe UI" w:cs="Segoe UI" w:eastAsia="Segoe UI"/>
         </w:rPr>
-        <w:t xml:space="preserve">Once CC-48 is copied to </w:t>
+        <w:t xml:space="preserve">CC-48 is done: the FRS set is on TISPH-DEV in docs/TISPH/frs/, so the branch itself is a candidate for retirement.</w:t>
       </w:r>
       <w:r>
         <w:rPr>
@@ -17086,13 +16731,13 @@
           <w:color w:val="1F3B57"/>
           <w:shd w:val="clear" w:color="auto" w:fill="F3F5F8"/>
         </w:rPr>
-        <w:t xml:space="preserve">TISPH-DEV</w:t>
+        <w:t xml:space="preserve"/>
       </w:r>
       <w:r>
         <w:rPr>
           <w:rFonts w:ascii="Segoe UI" w:hAnsi="Segoe UI" w:cs="Segoe UI" w:eastAsia="Segoe UI"/>
         </w:rPr>
-        <w:t xml:space="preserve">, the branch itself is a candidate for retirement.</w:t>
+        <w:t xml:space="preserve"/>
       </w:r>
     </w:p>
     <w:p xmlns:a="http://schemas.openxmlformats.org/drawingml/2006/main" xmlns:pic="http://schemas.openxmlformats.org/drawingml/2006/picture">
@@ -17456,25 +17101,25 @@
                 <w:sz w:val="16"/>
                 <w:szCs w:val="16"/>
               </w:rPr>
-              <w:t xml:space="preserve">Source of the Help (</w:t>
-            </w:r>
-            <w:r>
-              <w:rPr>
-                <w:rFonts w:ascii="Consolas" w:hAnsi="Consolas" w:cs="Consolas" w:eastAsia="Consolas"/>
-                <w:color w:val="1F3B57"/>
-                <w:sz w:val="14"/>
-                <w:szCs w:val="14"/>
-                <w:shd w:val="clear" w:color="auto" w:fill="F3F5F8"/>
-              </w:rPr>
-              <w:t xml:space="preserve">brokerverse/src/components/HelpPanel/helpRoutes.js</w:t>
-            </w:r>
-            <w:r>
-              <w:rPr>
-                <w:rFonts w:ascii="Segoe UI" w:hAnsi="Segoe UI" w:cs="Segoe UI" w:eastAsia="Segoe UI"/>
-                <w:sz w:val="16"/>
-                <w:szCs w:val="16"/>
-              </w:rPr>
-              <w:t xml:space="preserve">); to be split by work package MAN-A</w:t>
+              <w:t xml:space="preserve">Source of the base edition of the Help (brokerverse/scripts/build-help.js); the TISPH edition is built from docs/TISPH/manual/</w:t>
+            </w:r>
+            <w:r>
+              <w:rPr>
+                <w:rFonts w:ascii="Consolas" w:hAnsi="Consolas" w:cs="Consolas" w:eastAsia="Consolas"/>
+                <w:color w:val="1F3B57"/>
+                <w:sz w:val="14"/>
+                <w:szCs w:val="14"/>
+                <w:shd w:val="clear" w:color="auto" w:fill="F3F5F8"/>
+              </w:rPr>
+              <w:t xml:space="preserve"/>
+            </w:r>
+            <w:r>
+              <w:rPr>
+                <w:rFonts w:ascii="Segoe UI" w:hAnsi="Segoe UI" w:cs="Segoe UI" w:eastAsia="Segoe UI"/>
+                <w:sz w:val="16"/>
+                <w:szCs w:val="16"/>
+              </w:rPr>
+              <w:t xml:space="preserve"/>
             </w:r>
           </w:p>
         </w:tc>
@@ -17826,25 +17471,25 @@
                 <w:sz w:val="16"/>
                 <w:szCs w:val="16"/>
               </w:rPr>
-              <w:t xml:space="preserve"> (table purposes) and </w:t>
-            </w:r>
-            <w:r>
-              <w:rPr>
-                <w:rFonts w:ascii="Consolas" w:hAnsi="Consolas" w:cs="Consolas" w:eastAsia="Consolas"/>
-                <w:color w:val="1F3B57"/>
-                <w:sz w:val="14"/>
-                <w:szCs w:val="14"/>
-                <w:shd w:val="clear" w:color="auto" w:fill="F3F5F8"/>
-              </w:rPr>
-              <w:t xml:space="preserve">docs/TISPH/pack/TISPH_NFR_Compliance.docx</w:t>
-            </w:r>
-            <w:r>
-              <w:rPr>
-                <w:rFonts w:ascii="Segoe UI" w:hAnsi="Segoe UI" w:cs="Segoe UI" w:eastAsia="Segoe UI"/>
-                <w:sz w:val="16"/>
-                <w:szCs w:val="16"/>
-              </w:rPr>
-              <w:t xml:space="preserve"> (indicative load test)</w:t>
+              <w:t xml:space="preserve"> (table purposes) and docs/TISPH/pack/TISPH_NFR_Compliance.docx and docs/TISPH/testing/TISPH_Test_Strategy.docx (indicative load test)</w:t>
+            </w:r>
+            <w:r>
+              <w:rPr>
+                <w:rFonts w:ascii="Consolas" w:hAnsi="Consolas" w:cs="Consolas" w:eastAsia="Consolas"/>
+                <w:color w:val="1F3B57"/>
+                <w:sz w:val="14"/>
+                <w:szCs w:val="14"/>
+                <w:shd w:val="clear" w:color="auto" w:fill="F3F5F8"/>
+              </w:rPr>
+              <w:t xml:space="preserve"/>
+            </w:r>
+            <w:r>
+              <w:rPr>
+                <w:rFonts w:ascii="Segoe UI" w:hAnsi="Segoe UI" w:cs="Segoe UI" w:eastAsia="Segoe UI"/>
+                <w:sz w:val="16"/>
+                <w:szCs w:val="16"/>
+              </w:rPr>
+              <w:t xml:space="preserve"/>
             </w:r>
           </w:p>
         </w:tc>
@@ -18271,25 +17916,7 @@
                 <w:szCs w:val="14"/>
                 <w:shd w:val="clear" w:color="auto" w:fill="F3F5F8"/>
               </w:rPr>
-              <w:t xml:space="preserve">deploy/REFERENCE.md</w:t>
-            </w:r>
-            <w:r>
-              <w:rPr>
-                <w:rFonts w:ascii="Segoe UI" w:hAnsi="Segoe UI" w:cs="Segoe UI" w:eastAsia="Segoe UI"/>
-                <w:sz w:val="16"/>
-                <w:szCs w:val="16"/>
-              </w:rPr>
-              <w:t xml:space="preserve">, </w:t>
-            </w:r>
-            <w:r>
-              <w:rPr>
-                <w:rFonts w:ascii="Consolas" w:hAnsi="Consolas" w:cs="Consolas" w:eastAsia="Consolas"/>
-                <w:color w:val="1F3B57"/>
-                <w:sz w:val="14"/>
-                <w:szCs w:val="14"/>
-                <w:shd w:val="clear" w:color="auto" w:fill="F3F5F8"/>
-              </w:rPr>
-              <w:t xml:space="preserve">deploy/AZURE.md</w:t>
+              <w:t xml:space="preserve">deploy/README.md, deploy/REFERENCE.md, deploy/AZURE.md, deploy/RAILWAY.md</w:t>
             </w:r>
           </w:p>
         </w:tc>
@@ -18307,7 +17934,93 @@
                 <w:sz w:val="16"/>
                 <w:szCs w:val="16"/>
               </w:rPr>
-              <w:t xml:space="preserve">Current runtime reference and Azure runbook</w:t>
+              <w:t xml:space="preserve">Index of the deployment folder per TISPH environment, current runtime reference, Azure runbook, and the runbook of TISPH DEV on Railway (CC-42)</w:t>
+            </w:r>
+          </w:p>
+        </w:tc>
+      </w:tr>
+      <w:tr>
+        <w:trPr>
+          <w:cantSplit/>
+        </w:trPr>
+        <w:tc>
+          <w:tcPr>
+            <w:tcW w:w="4513" w:type="dxa"/>
+          </w:tcPr>
+          <w:p>
+            <w:pPr>
+              <w:spacing w:before="40" w:after="40" w:line="240" w:lineRule="auto"/>
+            </w:pPr>
+            <w:r>
+              <w:rPr>
+                <w:rFonts w:ascii="Consolas" w:hAnsi="Consolas" w:cs="Consolas" w:eastAsia="Consolas"/>
+                <w:color w:val="1F3B57"/>
+                <w:sz w:val="14"/>
+                <w:szCs w:val="14"/>
+                <w:shd w:val="clear" w:color="auto" w:fill="F3F5F8"/>
+              </w:rPr>
+              <w:t xml:space="preserve">deploy/RELEASE_PIPELINE.md, deploy/ec2/, deploy/package-backend.sh</w:t>
+            </w:r>
+          </w:p>
+        </w:tc>
+        <w:tc>
+          <w:tcPr>
+            <w:tcW w:w="4514" w:type="dxa"/>
+          </w:tcPr>
+          <w:p>
+            <w:pPr>
+              <w:spacing w:before="40" w:after="40" w:line="240" w:lineRule="auto"/>
+            </w:pPr>
+            <w:r>
+              <w:rPr>
+                <w:rFonts w:ascii="Segoe UI" w:hAnsi="Segoe UI" w:cs="Segoe UI" w:eastAsia="Segoe UI"/>
+                <w:sz w:val="16"/>
+                <w:szCs w:val="16"/>
+              </w:rPr>
+              <w:t xml:space="preserve">Read by the product pipeline that stays in the repository (ci.yml, deploy.yml, rollback.yml point to it; CC-41); its migrations policy (section 8) applies to TISPH</w:t>
+            </w:r>
+          </w:p>
+        </w:tc>
+      </w:tr>
+      <w:tr>
+        <w:trPr>
+          <w:cantSplit/>
+        </w:trPr>
+        <w:tc>
+          <w:tcPr>
+            <w:tcW w:w="4513" w:type="dxa"/>
+          </w:tcPr>
+          <w:p>
+            <w:pPr>
+              <w:spacing w:before="40" w:after="40" w:line="240" w:lineRule="auto"/>
+            </w:pPr>
+            <w:r>
+              <w:rPr>
+                <w:rFonts w:ascii="Consolas" w:hAnsi="Consolas" w:cs="Consolas" w:eastAsia="Consolas"/>
+                <w:color w:val="1F3B57"/>
+                <w:sz w:val="14"/>
+                <w:szCs w:val="14"/>
+                <w:shd w:val="clear" w:color="auto" w:fill="F3F5F8"/>
+              </w:rPr>
+              <w:t xml:space="preserve">docs/package/03_Contracts/ and docs/package/source/contracts/ (six templates)</w:t>
+            </w:r>
+          </w:p>
+        </w:tc>
+        <w:tc>
+          <w:tcPr>
+            <w:tcW w:w="4514" w:type="dxa"/>
+          </w:tcPr>
+          <w:p>
+            <w:pPr>
+              <w:spacing w:before="40" w:after="40" w:line="240" w:lineRule="auto"/>
+            </w:pPr>
+            <w:r>
+              <w:rPr>
+                <w:rFonts w:ascii="Segoe UI" w:hAnsi="Segoe UI" w:cs="Segoe UI" w:eastAsia="Segoe UI"/>
+                <w:sz w:val="16"/>
+                <w:szCs w:val="16"/>
+              </w:rPr>
+              <w:t xml:space="preserve">Unsigned product templates cited by docs/TISPH/pack/TISPH_Operations_and_Support.docx (A3.9, A3.10) and docs/TISPH/pack/TISPH_Delivery_Governance.docx (8.6) until the TISPH versions exist (P25, DA-4, GQ-14); remainder of CC-20</w:t>
             </w:r>
           </w:p>
         </w:tc>
@@ -18565,7 +18278,7 @@
                 <w:sz w:val="16"/>
                 <w:szCs w:val="16"/>
               </w:rPr>
-              <w:t xml:space="preserve">Planned item</w:t>
+              <w:t xml:space="preserve">Status</w:t>
             </w:r>
           </w:p>
         </w:tc>
@@ -18626,25 +18339,25 @@
                 <w:sz w:val="16"/>
                 <w:szCs w:val="16"/>
               </w:rPr>
-              <w:t xml:space="preserve">P29 (</w:t>
-            </w:r>
-            <w:r>
-              <w:rPr>
-                <w:rFonts w:ascii="Consolas" w:hAnsi="Consolas" w:cs="Consolas" w:eastAsia="Consolas"/>
-                <w:color w:val="1F3B57"/>
-                <w:sz w:val="14"/>
-                <w:szCs w:val="14"/>
-                <w:shd w:val="clear" w:color="auto" w:fill="F3F5F8"/>
-              </w:rPr>
-              <w:t xml:space="preserve">docs/TISPH/pack/TISPH_Operations_and_Support.docx</w:t>
-            </w:r>
-            <w:r>
-              <w:rPr>
-                <w:rFonts w:ascii="Segoe UI" w:hAnsi="Segoe UI" w:cs="Segoe UI" w:eastAsia="Segoe UI"/>
-                <w:sz w:val="16"/>
-                <w:szCs w:val="16"/>
-              </w:rPr>
-              <w:t xml:space="preserve"> 15.1)</w:t>
+              <w:t xml:space="preserve">Done 11 October 2026 (version 1.2); support hours and targets still need the support agreement (P29, DA-4)</w:t>
+            </w:r>
+            <w:r>
+              <w:rPr>
+                <w:rFonts w:ascii="Consolas" w:hAnsi="Consolas" w:cs="Consolas" w:eastAsia="Consolas"/>
+                <w:color w:val="1F3B57"/>
+                <w:sz w:val="14"/>
+                <w:szCs w:val="14"/>
+                <w:shd w:val="clear" w:color="auto" w:fill="F3F5F8"/>
+              </w:rPr>
+              <w:t xml:space="preserve"/>
+            </w:r>
+            <w:r>
+              <w:rPr>
+                <w:rFonts w:ascii="Segoe UI" w:hAnsi="Segoe UI" w:cs="Segoe UI" w:eastAsia="Segoe UI"/>
+                <w:sz w:val="16"/>
+                <w:szCs w:val="16"/>
+              </w:rPr>
+              <w:t xml:space="preserve"/>
             </w:r>
           </w:p>
         </w:tc>
@@ -18705,7 +18418,7 @@
                 <w:sz w:val="16"/>
                 <w:szCs w:val="16"/>
               </w:rPr>
-              <w:t xml:space="preserve">MAN-A, MAN-B</w:t>
+              <w:t xml:space="preserve">Done 11 October 2026 (version 1.2): TISPH roles, exact menus in the role chapters of the TISPH user manual</w:t>
             </w:r>
           </w:p>
         </w:tc>
@@ -18766,7 +18479,7 @@
                 <w:sz w:val="16"/>
                 <w:szCs w:val="16"/>
               </w:rPr>
-              <w:t xml:space="preserve">TISPH UAT test cases (DR-17)</w:t>
+              <w:t xml:space="preserve">Done 11 October 2026 (version 1.2): scenarios grouped by TISPH role; the TISPH UAT test cases stay in the test pack (DR-17)</w:t>
             </w:r>
           </w:p>
         </w:tc>
@@ -18827,7 +18540,7 @@
                 <w:sz w:val="16"/>
                 <w:szCs w:val="16"/>
               </w:rPr>
-              <w:t xml:space="preserve">With this pack's approval</w:t>
+              <w:t xml:space="preserve">Done 11 October 2026 (version 1.2): points to the TISPH pack, manual and release route</w:t>
             </w:r>
           </w:p>
         </w:tc>
@@ -18866,7 +18579,7 @@
         <w:rPr>
           <w:rFonts w:ascii="Segoe UI" w:hAnsi="Segoe UI" w:cs="Segoe UI" w:eastAsia="Segoe UI"/>
         </w:rPr>
-        <w:t xml:space="preserve">Status on 10 October 2026: CC-01 to CC-05, CC-07 to CC-23, CC-25 to CC-28, CC-35 to CC-39 and CC-43 to CC-45 are done (34 items). CC-06, CC-24, CC-29 to CC-34, CC-40 to CC-42 and CC-46 to CC-53 are pending (19 items), each with its reason in the Status column.</w:t>
+        <w:t xml:space="preserve">Status on 11 October 2026: CC-01 to CC-40 and CC-43 to CC-48 are done (46 items: 34 on 10 October, 12 on 11 October). CC-41 (code first) and CC-42 (Railway hosts TISPH DEV) are kept and corrected for TISPH. CC-49 to CC-53 (5 items) are pending: they concern the FRS branch and go when that branch is retired.</w:t>
       </w:r>
     </w:p>
     <w:tbl xmlns:a="http://schemas.openxmlformats.org/drawingml/2006/main" xmlns:pic="http://schemas.openxmlformats.org/drawingml/2006/picture">
@@ -19245,7 +18958,7 @@
         <w:rPr>
           <w:rFonts w:ascii="Segoe UI" w:hAnsi="Segoe UI" w:cs="Segoe UI" w:eastAsia="Segoe UI"/>
         </w:rPr>
-        <w:t xml:space="preserve">All paths are in </w:t>
+        <w:t xml:space="preserve">All paths are in TISPH-DEV at commit 58ad7702 unless a branch is named. The cleanup of 11 October 2026 is recorded in docs/archive/2026-10-11/README.md (archived items) and in the commits on TISPH-DEV after 869aef7.</w:t>
       </w:r>
       <w:r>
         <w:rPr>
@@ -19253,13 +18966,13 @@
           <w:color w:val="1F3B57"/>
           <w:shd w:val="clear" w:color="auto" w:fill="F3F5F8"/>
         </w:rPr>
-        <w:t xml:space="preserve">TISPH-DEV</w:t>
+        <w:t xml:space="preserve"/>
       </w:r>
       <w:r>
         <w:rPr>
           <w:rFonts w:ascii="Segoe UI" w:hAnsi="Segoe UI" w:cs="Segoe UI" w:eastAsia="Segoe UI"/>
         </w:rPr>
-        <w:t xml:space="preserve"> at commit </w:t>
+        <w:t xml:space="preserve"/>
       </w:r>
       <w:r>
         <w:rPr>
@@ -19267,13 +18980,13 @@
           <w:color w:val="1F3B57"/>
           <w:shd w:val="clear" w:color="auto" w:fill="F3F5F8"/>
         </w:rPr>
-        <w:t xml:space="preserve">58ad7702</w:t>
+        <w:t xml:space="preserve"/>
       </w:r>
       <w:r>
         <w:rPr>
           <w:rFonts w:ascii="Segoe UI" w:hAnsi="Segoe UI" w:cs="Segoe UI" w:eastAsia="Segoe UI"/>
         </w:rPr>
-        <w:t xml:space="preserve"> unless a branch is named.</w:t>
+        <w:t xml:space="preserve"/>
       </w:r>
     </w:p>
     <w:p xmlns:a="http://schemas.openxmlformats.org/drawingml/2006/main" xmlns:pic="http://schemas.openxmlformats.org/drawingml/2006/picture">
@@ -20750,7 +20463,7 @@
                 <w:sz w:val="16"/>
                 <w:szCs w:val="16"/>
               </w:rPr>
-              <w:t xml:space="preserve">-</w:t>
+              <w:t xml:space="preserve">1</w:t>
             </w:r>
           </w:p>
         </w:tc>
@@ -20768,7 +20481,7 @@
                 <w:sz w:val="16"/>
                 <w:szCs w:val="16"/>
               </w:rPr>
-              <w:t xml:space="preserve">No pending items are recorded in this version.</w:t>
+              <w:t xml:space="preserve">Retire the FRS branch with CC-49 to CC-53 (the FRS set is on TISPH-DEV, CC-48)</w:t>
             </w:r>
           </w:p>
         </w:tc>
@@ -20786,7 +20499,7 @@
                 <w:sz w:val="16"/>
                 <w:szCs w:val="16"/>
               </w:rPr>
-              <w:t xml:space="preserve">-</w:t>
+              <w:t xml:space="preserve">iorta TechNXT Delivery lead</w:t>
             </w:r>
           </w:p>
         </w:tc>
@@ -20804,7 +20517,84 @@
                 <w:sz w:val="16"/>
                 <w:szCs w:val="16"/>
               </w:rPr>
-              <w:t xml:space="preserve">-</w:t>
+              <w:t xml:space="preserve">Open</w:t>
+            </w:r>
+          </w:p>
+        </w:tc>
+      </w:tr>
+      <w:tr>
+        <w:trPr>
+          <w:cantSplit/>
+        </w:trPr>
+        <w:tc>
+          <w:tcPr>
+            <w:tcW w:w="1250" w:type="dxa"/>
+          </w:tcPr>
+          <w:p>
+            <w:pPr>
+              <w:spacing w:before="40" w:after="40" w:line="240" w:lineRule="auto"/>
+            </w:pPr>
+            <w:r>
+              <w:rPr>
+                <w:rFonts w:ascii="Segoe UI" w:hAnsi="Segoe UI" w:cs="Segoe UI" w:eastAsia="Segoe UI"/>
+                <w:sz w:val="16"/>
+                <w:szCs w:val="16"/>
+              </w:rPr>
+              <w:t xml:space="preserve">2</w:t>
+            </w:r>
+          </w:p>
+        </w:tc>
+        <w:tc>
+          <w:tcPr>
+            <w:tcW w:w="5000" w:type="dxa"/>
+          </w:tcPr>
+          <w:p>
+            <w:pPr>
+              <w:spacing w:before="40" w:after="40" w:line="240" w:lineRule="auto"/>
+            </w:pPr>
+            <w:r>
+              <w:rPr>
+                <w:rFonts w:ascii="Segoe UI" w:hAnsi="Segoe UI" w:cs="Segoe UI" w:eastAsia="Segoe UI"/>
+                <w:sz w:val="16"/>
+                <w:szCs w:val="16"/>
+              </w:rPr>
+              <w:t xml:space="preserve">Replace the six contract templates of docs/package/03_Contracts/ by the TISPH support agreement, exit plan and hypercare certificate, then remove them and change the citations in the Operations and Delivery Governance documents (P25, DA-4, GQ-14)</w:t>
+            </w:r>
+          </w:p>
+        </w:tc>
+        <w:tc>
+          <w:tcPr>
+            <w:tcW w:w="1300" w:type="dxa"/>
+          </w:tcPr>
+          <w:p>
+            <w:pPr>
+              <w:spacing w:before="40" w:after="40" w:line="240" w:lineRule="auto"/>
+            </w:pPr>
+            <w:r>
+              <w:rPr>
+                <w:rFonts w:ascii="Segoe UI" w:hAnsi="Segoe UI" w:cs="Segoe UI" w:eastAsia="Segoe UI"/>
+                <w:sz w:val="16"/>
+                <w:szCs w:val="16"/>
+              </w:rPr>
+              <w:t xml:space="preserve">iorta TechNXT Project Manager with TISPH</w:t>
+            </w:r>
+          </w:p>
+        </w:tc>
+        <w:tc>
+          <w:tcPr>
+            <w:tcW w:w="1477" w:type="dxa"/>
+          </w:tcPr>
+          <w:p>
+            <w:pPr>
+              <w:spacing w:before="40" w:after="40" w:line="240" w:lineRule="auto"/>
+            </w:pPr>
+            <w:r>
+              <w:rPr>
+                <w:rFonts w:ascii="Segoe UI" w:hAnsi="Segoe UI" w:cs="Segoe UI" w:eastAsia="Segoe UI"/>
+                <w:sz w:val="16"/>
+                <w:szCs w:val="16"/>
+              </w:rPr>
+              <w:t xml:space="preserve">Open</w:t>
             </w:r>
           </w:p>
         </w:tc>

</xml_diff>